<commit_message>
Partie 5 – Prompts pour les applications métier
</commit_message>
<xml_diff>
--- a/ai_business_assistant/AtelierPromptEngineering.docx
+++ b/ai_business_assistant/AtelierPromptEngineering.docx
@@ -3793,14 +3793,9 @@
         <w:spacing w:line="360" w:lineRule="auto"/>
         <w:ind w:leftChars="0"/>
         <w:rPr>
-          <w:rFonts w:hint="default" w:ascii="Times New Roman" w:hAnsi="Times New Roman" w:cs="Times New Roman"/>
-          <w:sz w:val="24"/>
-          <w:szCs w:val="24"/>
-          <w:lang w:val="en-US"/>
-        </w:rPr>
-      </w:pPr>
-      <w:bookmarkStart w:id="0" w:name="_GoBack"/>
-      <w:bookmarkEnd w:id="0"/>
+          <w:vertAlign w:val="subscript"/>
+        </w:rPr>
+      </w:pPr>
       <w:r>
         <w:drawing>
           <wp:inline distT="0" distB="0" distL="114300" distR="114300">
@@ -3844,6 +3839,1539 @@
           </wp:inline>
         </w:drawing>
       </w:r>
+    </w:p>
+    <w:p>
+      <w:pPr>
+        <w:numPr>
+          <w:numId w:val="0"/>
+        </w:numPr>
+        <w:spacing w:line="360" w:lineRule="auto"/>
+        <w:ind w:leftChars="0"/>
+      </w:pPr>
+    </w:p>
+    <w:p>
+      <w:pPr>
+        <w:numPr>
+          <w:numId w:val="0"/>
+        </w:numPr>
+        <w:spacing w:line="360" w:lineRule="auto"/>
+        <w:ind w:leftChars="0"/>
+        <w:rPr>
+          <w:rFonts w:hint="default" w:ascii="Times New Roman" w:hAnsi="Times New Roman" w:cs="Times New Roman"/>
+          <w:color w:val="7030A0"/>
+          <w:sz w:val="24"/>
+          <w:szCs w:val="24"/>
+          <w:lang w:val="en-US"/>
+        </w:rPr>
+      </w:pPr>
+      <w:r>
+        <w:rPr>
+          <w:rFonts w:hint="default" w:ascii="Times New Roman" w:hAnsi="Times New Roman" w:cs="Times New Roman"/>
+          <w:color w:val="7030A0"/>
+          <w:sz w:val="24"/>
+          <w:szCs w:val="24"/>
+          <w:lang w:val="en-US"/>
+        </w:rPr>
+        <w:t>Partie 5 – Prompts pour les applications métier</w:t>
+      </w:r>
+    </w:p>
+    <w:p>
+      <w:pPr>
+        <w:numPr>
+          <w:numId w:val="0"/>
+        </w:numPr>
+        <w:spacing w:line="360" w:lineRule="auto"/>
+        <w:ind w:leftChars="0"/>
+        <w:rPr>
+          <w:rFonts w:hint="default" w:ascii="Times New Roman" w:hAnsi="Times New Roman" w:cs="Times New Roman"/>
+          <w:color w:val="7030A0"/>
+          <w:sz w:val="24"/>
+          <w:szCs w:val="24"/>
+          <w:lang w:val="en-US"/>
+        </w:rPr>
+      </w:pPr>
+    </w:p>
+    <w:p>
+      <w:pPr>
+        <w:numPr>
+          <w:numId w:val="0"/>
+        </w:numPr>
+        <w:spacing w:line="360" w:lineRule="auto"/>
+        <w:ind w:leftChars="0"/>
+        <w:rPr>
+          <w:rFonts w:hint="default" w:ascii="Times New Roman" w:hAnsi="Times New Roman" w:cs="Times New Roman"/>
+          <w:color w:val="7030A0"/>
+          <w:sz w:val="24"/>
+          <w:szCs w:val="24"/>
+          <w:lang w:val="en-US"/>
+        </w:rPr>
+      </w:pPr>
+      <w:r>
+        <w:rPr>
+          <w:rFonts w:hint="default" w:ascii="Times New Roman" w:hAnsi="Times New Roman" w:cs="Times New Roman"/>
+          <w:color w:val="auto"/>
+          <w:sz w:val="24"/>
+          <w:szCs w:val="24"/>
+          <w:lang w:val="en-US"/>
+        </w:rPr>
+        <w:t xml:space="preserve">1) Créer un prompt permettant de résumer un document avec les contraintes : maximum 250 mots ; conserver les informations factuelles ; identifier les objectifs ; identifier les résultats ; identifier les recommandations ; n'inventer aucune information. </w:t>
+      </w:r>
+    </w:p>
+    <w:p>
+      <w:pPr>
+        <w:numPr>
+          <w:numId w:val="0"/>
+        </w:numPr>
+        <w:spacing w:line="360" w:lineRule="auto"/>
+        <w:ind w:leftChars="0"/>
+        <w:rPr>
+          <w:rFonts w:hint="default" w:ascii="Times New Roman" w:hAnsi="Times New Roman" w:cs="Times New Roman"/>
+          <w:color w:val="7030A0"/>
+          <w:sz w:val="24"/>
+          <w:szCs w:val="24"/>
+          <w:lang w:val="en-US"/>
+        </w:rPr>
+      </w:pPr>
+    </w:p>
+    <w:p>
+      <w:pPr>
+        <w:numPr>
+          <w:numId w:val="0"/>
+        </w:numPr>
+        <w:spacing w:line="360" w:lineRule="auto"/>
+        <w:ind w:leftChars="0"/>
+        <w:rPr>
+          <w:rFonts w:hint="default" w:ascii="Times New Roman" w:hAnsi="Times New Roman" w:cs="Times New Roman"/>
+          <w:color w:val="7030A0"/>
+          <w:sz w:val="24"/>
+          <w:szCs w:val="24"/>
+          <w:lang w:val="en-US"/>
+        </w:rPr>
+      </w:pPr>
+      <w:r>
+        <w:rPr>
+          <w:rFonts w:hint="default" w:ascii="Times New Roman" w:hAnsi="Times New Roman" w:cs="Times New Roman"/>
+          <w:color w:val="7030A0"/>
+          <w:sz w:val="24"/>
+          <w:szCs w:val="24"/>
+          <w:lang w:val="en-US"/>
+        </w:rPr>
+        <w:t>PROMPT</w:t>
+      </w:r>
+    </w:p>
+    <w:p>
+      <w:pPr>
+        <w:spacing w:after="40" w:line="360" w:lineRule="auto"/>
+        <w:rPr>
+          <w:rFonts w:hint="default" w:ascii="Times New Roman" w:hAnsi="Times New Roman" w:cs="Times New Roman"/>
+          <w:sz w:val="24"/>
+          <w:szCs w:val="24"/>
+        </w:rPr>
+      </w:pPr>
+      <w:r>
+        <w:rPr>
+          <w:rFonts w:hint="default" w:ascii="Times New Roman" w:hAnsi="Times New Roman" w:eastAsia="Consolas" w:cs="Times New Roman"/>
+          <w:sz w:val="24"/>
+          <w:szCs w:val="24"/>
+        </w:rPr>
+        <w:t>Résume le document ci-dessous en respectant strictement les</w:t>
+      </w:r>
+    </w:p>
+    <w:p>
+      <w:pPr>
+        <w:spacing w:after="40" w:line="360" w:lineRule="auto"/>
+        <w:rPr>
+          <w:rFonts w:hint="default" w:ascii="Times New Roman" w:hAnsi="Times New Roman" w:cs="Times New Roman"/>
+          <w:sz w:val="24"/>
+          <w:szCs w:val="24"/>
+        </w:rPr>
+      </w:pPr>
+      <w:r>
+        <w:rPr>
+          <w:rFonts w:hint="default" w:ascii="Times New Roman" w:hAnsi="Times New Roman" w:eastAsia="Consolas" w:cs="Times New Roman"/>
+          <w:sz w:val="24"/>
+          <w:szCs w:val="24"/>
+        </w:rPr>
+        <w:t>contraintes suivantes :</w:t>
+      </w:r>
+    </w:p>
+    <w:p>
+      <w:pPr>
+        <w:spacing w:after="40" w:line="360" w:lineRule="auto"/>
+        <w:rPr>
+          <w:rFonts w:hint="default" w:ascii="Times New Roman" w:hAnsi="Times New Roman" w:cs="Times New Roman"/>
+          <w:sz w:val="24"/>
+          <w:szCs w:val="24"/>
+        </w:rPr>
+      </w:pPr>
+      <w:r>
+        <w:rPr>
+          <w:rFonts w:hint="default" w:ascii="Times New Roman" w:hAnsi="Times New Roman" w:eastAsia="Consolas" w:cs="Times New Roman"/>
+          <w:sz w:val="24"/>
+          <w:szCs w:val="24"/>
+        </w:rPr>
+        <w:t>- Maximum 250 mots.</w:t>
+      </w:r>
+    </w:p>
+    <w:p>
+      <w:pPr>
+        <w:spacing w:after="40" w:line="360" w:lineRule="auto"/>
+        <w:rPr>
+          <w:rFonts w:hint="default" w:ascii="Times New Roman" w:hAnsi="Times New Roman" w:cs="Times New Roman"/>
+          <w:sz w:val="24"/>
+          <w:szCs w:val="24"/>
+        </w:rPr>
+      </w:pPr>
+      <w:r>
+        <w:rPr>
+          <w:rFonts w:hint="default" w:ascii="Times New Roman" w:hAnsi="Times New Roman" w:eastAsia="Consolas" w:cs="Times New Roman"/>
+          <w:sz w:val="24"/>
+          <w:szCs w:val="24"/>
+        </w:rPr>
+        <w:t>- Conserve uniquement les informations factuelles présentes dans le</w:t>
+      </w:r>
+    </w:p>
+    <w:p>
+      <w:pPr>
+        <w:spacing w:after="40" w:line="360" w:lineRule="auto"/>
+        <w:rPr>
+          <w:rFonts w:hint="default" w:ascii="Times New Roman" w:hAnsi="Times New Roman" w:cs="Times New Roman"/>
+          <w:sz w:val="24"/>
+          <w:szCs w:val="24"/>
+        </w:rPr>
+      </w:pPr>
+      <w:r>
+        <w:rPr>
+          <w:rFonts w:hint="default" w:ascii="Times New Roman" w:hAnsi="Times New Roman" w:eastAsia="Consolas" w:cs="Times New Roman"/>
+          <w:sz w:val="24"/>
+          <w:szCs w:val="24"/>
+        </w:rPr>
+        <w:t xml:space="preserve">  document (n'en ajoute aucune).</w:t>
+      </w:r>
+    </w:p>
+    <w:p>
+      <w:pPr>
+        <w:spacing w:after="40" w:line="360" w:lineRule="auto"/>
+        <w:rPr>
+          <w:rFonts w:hint="default" w:ascii="Times New Roman" w:hAnsi="Times New Roman" w:cs="Times New Roman"/>
+          <w:sz w:val="24"/>
+          <w:szCs w:val="24"/>
+        </w:rPr>
+      </w:pPr>
+      <w:r>
+        <w:rPr>
+          <w:rFonts w:hint="default" w:ascii="Times New Roman" w:hAnsi="Times New Roman" w:eastAsia="Consolas" w:cs="Times New Roman"/>
+          <w:sz w:val="24"/>
+          <w:szCs w:val="24"/>
+        </w:rPr>
+        <w:t>- Identifie explicitement : les objectifs du document, les résultats</w:t>
+      </w:r>
+    </w:p>
+    <w:p>
+      <w:pPr>
+        <w:spacing w:after="40" w:line="360" w:lineRule="auto"/>
+        <w:rPr>
+          <w:rFonts w:hint="default" w:ascii="Times New Roman" w:hAnsi="Times New Roman" w:cs="Times New Roman"/>
+          <w:sz w:val="24"/>
+          <w:szCs w:val="24"/>
+        </w:rPr>
+      </w:pPr>
+      <w:r>
+        <w:rPr>
+          <w:rFonts w:hint="default" w:ascii="Times New Roman" w:hAnsi="Times New Roman" w:eastAsia="Consolas" w:cs="Times New Roman"/>
+          <w:sz w:val="24"/>
+          <w:szCs w:val="24"/>
+        </w:rPr>
+        <w:t xml:space="preserve">  obtenus, et les recommandations formulées.</w:t>
+      </w:r>
+    </w:p>
+    <w:p>
+      <w:pPr>
+        <w:spacing w:after="40" w:line="360" w:lineRule="auto"/>
+        <w:rPr>
+          <w:rFonts w:hint="default" w:ascii="Times New Roman" w:hAnsi="Times New Roman" w:cs="Times New Roman"/>
+          <w:sz w:val="24"/>
+          <w:szCs w:val="24"/>
+        </w:rPr>
+      </w:pPr>
+      <w:r>
+        <w:rPr>
+          <w:rFonts w:hint="default" w:ascii="Times New Roman" w:hAnsi="Times New Roman" w:eastAsia="Consolas" w:cs="Times New Roman"/>
+          <w:sz w:val="24"/>
+          <w:szCs w:val="24"/>
+        </w:rPr>
+        <w:t>- Structure la réponse en 3 sections : Objectifs / Résultats /</w:t>
+      </w:r>
+    </w:p>
+    <w:p>
+      <w:pPr>
+        <w:spacing w:after="40" w:line="360" w:lineRule="auto"/>
+        <w:rPr>
+          <w:rFonts w:hint="default" w:ascii="Times New Roman" w:hAnsi="Times New Roman" w:cs="Times New Roman"/>
+          <w:sz w:val="24"/>
+          <w:szCs w:val="24"/>
+        </w:rPr>
+      </w:pPr>
+      <w:r>
+        <w:rPr>
+          <w:rFonts w:hint="default" w:ascii="Times New Roman" w:hAnsi="Times New Roman" w:eastAsia="Consolas" w:cs="Times New Roman"/>
+          <w:sz w:val="24"/>
+          <w:szCs w:val="24"/>
+        </w:rPr>
+        <w:t xml:space="preserve">  Recommandations.</w:t>
+      </w:r>
+    </w:p>
+    <w:p>
+      <w:pPr>
+        <w:spacing w:after="40" w:line="360" w:lineRule="auto"/>
+        <w:rPr>
+          <w:rFonts w:hint="default" w:ascii="Times New Roman" w:hAnsi="Times New Roman" w:cs="Times New Roman"/>
+          <w:sz w:val="24"/>
+          <w:szCs w:val="24"/>
+        </w:rPr>
+      </w:pPr>
+    </w:p>
+    <w:p>
+      <w:pPr>
+        <w:spacing w:after="40" w:line="360" w:lineRule="auto"/>
+        <w:rPr>
+          <w:rFonts w:hint="default" w:ascii="Times New Roman" w:hAnsi="Times New Roman" w:cs="Times New Roman"/>
+          <w:sz w:val="24"/>
+          <w:szCs w:val="24"/>
+        </w:rPr>
+      </w:pPr>
+      <w:r>
+        <w:rPr>
+          <w:rFonts w:hint="default" w:ascii="Times New Roman" w:hAnsi="Times New Roman" w:eastAsia="Consolas" w:cs="Times New Roman"/>
+          <w:color w:val="7030A0"/>
+          <w:sz w:val="24"/>
+          <w:szCs w:val="24"/>
+        </w:rPr>
+        <w:t>Document :</w:t>
+      </w:r>
+    </w:p>
+    <w:p>
+      <w:pPr>
+        <w:spacing w:after="40" w:line="360" w:lineRule="auto"/>
+        <w:rPr>
+          <w:rFonts w:hint="default" w:ascii="Times New Roman" w:hAnsi="Times New Roman" w:cs="Times New Roman"/>
+          <w:sz w:val="24"/>
+          <w:szCs w:val="24"/>
+        </w:rPr>
+      </w:pPr>
+      <w:r>
+        <w:rPr>
+          <w:rFonts w:hint="default" w:ascii="Times New Roman" w:hAnsi="Times New Roman" w:eastAsia="Consolas" w:cs="Times New Roman"/>
+          <w:sz w:val="24"/>
+          <w:szCs w:val="24"/>
+        </w:rPr>
+        <w:t>{{DOCUMENT}}</w:t>
+      </w:r>
+    </w:p>
+    <w:p>
+      <w:pPr>
+        <w:numPr>
+          <w:numId w:val="0"/>
+        </w:numPr>
+        <w:spacing w:line="360" w:lineRule="auto"/>
+        <w:ind w:leftChars="0"/>
+        <w:rPr>
+          <w:rFonts w:hint="default" w:ascii="Times New Roman" w:hAnsi="Times New Roman" w:cs="Times New Roman"/>
+          <w:color w:val="7030A0"/>
+          <w:sz w:val="24"/>
+          <w:szCs w:val="24"/>
+          <w:lang w:val="en-US"/>
+        </w:rPr>
+      </w:pPr>
+    </w:p>
+    <w:p>
+      <w:pPr>
+        <w:numPr>
+          <w:ilvl w:val="0"/>
+          <w:numId w:val="2"/>
+        </w:numPr>
+        <w:spacing w:line="360" w:lineRule="auto"/>
+        <w:ind w:left="0" w:leftChars="0" w:firstLine="0" w:firstLineChars="0"/>
+        <w:rPr>
+          <w:rFonts w:hint="default" w:ascii="Times New Roman" w:hAnsi="Times New Roman" w:cs="Times New Roman"/>
+          <w:color w:val="auto"/>
+          <w:sz w:val="24"/>
+          <w:szCs w:val="24"/>
+          <w:lang w:val="en-US"/>
+        </w:rPr>
+      </w:pPr>
+      <w:r>
+        <w:rPr>
+          <w:rFonts w:hint="default" w:ascii="Times New Roman" w:hAnsi="Times New Roman" w:cs="Times New Roman"/>
+          <w:color w:val="auto"/>
+          <w:sz w:val="24"/>
+          <w:szCs w:val="24"/>
+          <w:lang w:val="en-US"/>
+        </w:rPr>
+        <w:t xml:space="preserve">Créer un prompt permettant de traduire un document français en anglais avec les contraintes : conserver le sens ; conserver la structure ; conserver les termes techniques ; ne pas résumer ; ne rajoute aucune information </w:t>
+      </w:r>
+    </w:p>
+    <w:p>
+      <w:pPr>
+        <w:numPr>
+          <w:numId w:val="0"/>
+        </w:numPr>
+        <w:spacing w:line="360" w:lineRule="auto"/>
+        <w:ind w:leftChars="0"/>
+        <w:rPr>
+          <w:rFonts w:hint="default" w:ascii="Times New Roman" w:hAnsi="Times New Roman" w:cs="Times New Roman"/>
+          <w:color w:val="auto"/>
+          <w:sz w:val="24"/>
+          <w:szCs w:val="24"/>
+          <w:lang w:val="en-US"/>
+        </w:rPr>
+      </w:pPr>
+    </w:p>
+    <w:p>
+      <w:pPr>
+        <w:spacing w:before="40" w:after="60" w:line="360" w:lineRule="auto"/>
+        <w:rPr>
+          <w:rFonts w:hint="default" w:ascii="Times New Roman" w:hAnsi="Times New Roman" w:cs="Times New Roman"/>
+          <w:sz w:val="24"/>
+          <w:szCs w:val="24"/>
+          <w:shd w:val="clear" w:color="FFFFFF" w:fill="D9D9D9"/>
+        </w:rPr>
+      </w:pPr>
+      <w:r>
+        <w:rPr>
+          <w:rFonts w:hint="default" w:ascii="Times New Roman" w:hAnsi="Times New Roman" w:cs="Times New Roman"/>
+          <w:b/>
+          <w:bCs/>
+          <w:color w:val="555555"/>
+          <w:sz w:val="24"/>
+          <w:szCs w:val="24"/>
+          <w:shd w:val="clear" w:color="FFFFFF" w:fill="D9D9D9"/>
+        </w:rPr>
+        <w:t>PROMPT</w:t>
+      </w:r>
+    </w:p>
+    <w:p>
+      <w:pPr>
+        <w:spacing w:after="40" w:line="360" w:lineRule="auto"/>
+        <w:rPr>
+          <w:rFonts w:hint="default" w:ascii="Times New Roman" w:hAnsi="Times New Roman" w:cs="Times New Roman"/>
+          <w:sz w:val="24"/>
+          <w:szCs w:val="24"/>
+          <w:shd w:val="clear" w:color="FFFFFF" w:fill="D9D9D9"/>
+        </w:rPr>
+      </w:pPr>
+      <w:r>
+        <w:rPr>
+          <w:rFonts w:hint="default" w:ascii="Times New Roman" w:hAnsi="Times New Roman" w:eastAsia="Consolas" w:cs="Times New Roman"/>
+          <w:sz w:val="24"/>
+          <w:szCs w:val="24"/>
+          <w:shd w:val="clear" w:color="FFFFFF" w:fill="D9D9D9"/>
+        </w:rPr>
+        <w:t>Traduis le document suivant du français vers l'anglais en respectant</w:t>
+      </w:r>
+    </w:p>
+    <w:p>
+      <w:pPr>
+        <w:spacing w:after="40" w:line="360" w:lineRule="auto"/>
+        <w:rPr>
+          <w:rFonts w:hint="default" w:ascii="Times New Roman" w:hAnsi="Times New Roman" w:cs="Times New Roman"/>
+          <w:sz w:val="24"/>
+          <w:szCs w:val="24"/>
+          <w:shd w:val="clear" w:color="FFFFFF" w:fill="D9D9D9"/>
+        </w:rPr>
+      </w:pPr>
+      <w:r>
+        <w:rPr>
+          <w:rFonts w:hint="default" w:ascii="Times New Roman" w:hAnsi="Times New Roman" w:eastAsia="Consolas" w:cs="Times New Roman"/>
+          <w:sz w:val="24"/>
+          <w:szCs w:val="24"/>
+          <w:shd w:val="clear" w:color="FFFFFF" w:fill="D9D9D9"/>
+        </w:rPr>
+        <w:t>les contraintes suivantes :</w:t>
+      </w:r>
+    </w:p>
+    <w:p>
+      <w:pPr>
+        <w:spacing w:after="40" w:line="360" w:lineRule="auto"/>
+        <w:rPr>
+          <w:rFonts w:hint="default" w:ascii="Times New Roman" w:hAnsi="Times New Roman" w:cs="Times New Roman"/>
+          <w:sz w:val="24"/>
+          <w:szCs w:val="24"/>
+          <w:shd w:val="clear" w:color="FFFFFF" w:fill="D9D9D9"/>
+        </w:rPr>
+      </w:pPr>
+      <w:r>
+        <w:rPr>
+          <w:rFonts w:hint="default" w:ascii="Times New Roman" w:hAnsi="Times New Roman" w:eastAsia="Consolas" w:cs="Times New Roman"/>
+          <w:sz w:val="24"/>
+          <w:szCs w:val="24"/>
+          <w:shd w:val="clear" w:color="FFFFFF" w:fill="D9D9D9"/>
+        </w:rPr>
+        <w:t>- Conserve le sens exact du texte source.</w:t>
+      </w:r>
+    </w:p>
+    <w:p>
+      <w:pPr>
+        <w:spacing w:after="40" w:line="360" w:lineRule="auto"/>
+        <w:rPr>
+          <w:rFonts w:hint="default" w:ascii="Times New Roman" w:hAnsi="Times New Roman" w:cs="Times New Roman"/>
+          <w:sz w:val="24"/>
+          <w:szCs w:val="24"/>
+          <w:shd w:val="clear" w:color="FFFFFF" w:fill="D9D9D9"/>
+        </w:rPr>
+      </w:pPr>
+      <w:r>
+        <w:rPr>
+          <w:rFonts w:hint="default" w:ascii="Times New Roman" w:hAnsi="Times New Roman" w:eastAsia="Consolas" w:cs="Times New Roman"/>
+          <w:sz w:val="24"/>
+          <w:szCs w:val="24"/>
+          <w:shd w:val="clear" w:color="FFFFFF" w:fill="D9D9D9"/>
+        </w:rPr>
+        <w:t>- Conserve la structure (titres, paragraphes, listes).</w:t>
+      </w:r>
+    </w:p>
+    <w:p>
+      <w:pPr>
+        <w:spacing w:after="40" w:line="360" w:lineRule="auto"/>
+        <w:rPr>
+          <w:rFonts w:hint="default" w:ascii="Times New Roman" w:hAnsi="Times New Roman" w:cs="Times New Roman"/>
+          <w:sz w:val="24"/>
+          <w:szCs w:val="24"/>
+          <w:shd w:val="clear" w:color="FFFFFF" w:fill="D9D9D9"/>
+        </w:rPr>
+      </w:pPr>
+      <w:r>
+        <w:rPr>
+          <w:rFonts w:hint="default" w:ascii="Times New Roman" w:hAnsi="Times New Roman" w:eastAsia="Consolas" w:cs="Times New Roman"/>
+          <w:sz w:val="24"/>
+          <w:szCs w:val="24"/>
+          <w:shd w:val="clear" w:color="FFFFFF" w:fill="D9D9D9"/>
+        </w:rPr>
+        <w:t>- Conserve les termes techniques dans leur forme standard en anglais</w:t>
+      </w:r>
+    </w:p>
+    <w:p>
+      <w:pPr>
+        <w:spacing w:after="40" w:line="360" w:lineRule="auto"/>
+        <w:rPr>
+          <w:rFonts w:hint="default" w:ascii="Times New Roman" w:hAnsi="Times New Roman" w:cs="Times New Roman"/>
+          <w:sz w:val="24"/>
+          <w:szCs w:val="24"/>
+          <w:shd w:val="clear" w:color="FFFFFF" w:fill="D9D9D9"/>
+        </w:rPr>
+      </w:pPr>
+      <w:r>
+        <w:rPr>
+          <w:rFonts w:hint="default" w:ascii="Times New Roman" w:hAnsi="Times New Roman" w:eastAsia="Consolas" w:cs="Times New Roman"/>
+          <w:sz w:val="24"/>
+          <w:szCs w:val="24"/>
+          <w:shd w:val="clear" w:color="FFFFFF" w:fill="D9D9D9"/>
+        </w:rPr>
+        <w:t xml:space="preserve">  (ne les traduis pas littéralement si un terme consacré existe).</w:t>
+      </w:r>
+    </w:p>
+    <w:p>
+      <w:pPr>
+        <w:spacing w:after="40" w:line="360" w:lineRule="auto"/>
+        <w:rPr>
+          <w:rFonts w:hint="default" w:ascii="Times New Roman" w:hAnsi="Times New Roman" w:cs="Times New Roman"/>
+          <w:sz w:val="24"/>
+          <w:szCs w:val="24"/>
+          <w:shd w:val="clear" w:color="FFFFFF" w:fill="D9D9D9"/>
+        </w:rPr>
+      </w:pPr>
+      <w:r>
+        <w:rPr>
+          <w:rFonts w:hint="default" w:ascii="Times New Roman" w:hAnsi="Times New Roman" w:eastAsia="Consolas" w:cs="Times New Roman"/>
+          <w:sz w:val="24"/>
+          <w:szCs w:val="24"/>
+          <w:shd w:val="clear" w:color="FFFFFF" w:fill="D9D9D9"/>
+        </w:rPr>
+        <w:t>- Ne résume pas le contenu : traduis intégralement.</w:t>
+      </w:r>
+    </w:p>
+    <w:p>
+      <w:pPr>
+        <w:spacing w:after="40" w:line="360" w:lineRule="auto"/>
+        <w:rPr>
+          <w:rFonts w:hint="default" w:ascii="Times New Roman" w:hAnsi="Times New Roman" w:cs="Times New Roman"/>
+          <w:sz w:val="24"/>
+          <w:szCs w:val="24"/>
+          <w:shd w:val="clear" w:color="FFFFFF" w:fill="D9D9D9"/>
+        </w:rPr>
+      </w:pPr>
+      <w:r>
+        <w:rPr>
+          <w:rFonts w:hint="default" w:ascii="Times New Roman" w:hAnsi="Times New Roman" w:eastAsia="Consolas" w:cs="Times New Roman"/>
+          <w:sz w:val="24"/>
+          <w:szCs w:val="24"/>
+          <w:shd w:val="clear" w:color="FFFFFF" w:fill="D9D9D9"/>
+        </w:rPr>
+        <w:t>- N'ajoute aucune information, note ou commentaire absent du texte</w:t>
+      </w:r>
+      <w:r>
+        <w:rPr>
+          <w:rFonts w:hint="default" w:ascii="Times New Roman" w:hAnsi="Times New Roman" w:eastAsia="Consolas" w:cs="Times New Roman"/>
+          <w:sz w:val="24"/>
+          <w:szCs w:val="24"/>
+          <w:shd w:val="clear" w:color="FFFFFF" w:fill="D9D9D9"/>
+          <w:lang w:val="en-US"/>
+        </w:rPr>
+        <w:t xml:space="preserve"> </w:t>
+      </w:r>
+      <w:r>
+        <w:rPr>
+          <w:rFonts w:hint="default" w:ascii="Times New Roman" w:hAnsi="Times New Roman" w:eastAsia="Consolas" w:cs="Times New Roman"/>
+          <w:sz w:val="24"/>
+          <w:szCs w:val="24"/>
+          <w:shd w:val="clear" w:color="FFFFFF" w:fill="D9D9D9"/>
+        </w:rPr>
+        <w:t>source.</w:t>
+      </w:r>
+    </w:p>
+    <w:p>
+      <w:pPr>
+        <w:spacing w:after="40" w:line="360" w:lineRule="auto"/>
+        <w:rPr>
+          <w:rFonts w:hint="default" w:ascii="Times New Roman" w:hAnsi="Times New Roman" w:cs="Times New Roman"/>
+          <w:sz w:val="24"/>
+          <w:szCs w:val="24"/>
+          <w:shd w:val="clear" w:color="FFFFFF" w:fill="D9D9D9"/>
+        </w:rPr>
+      </w:pPr>
+    </w:p>
+    <w:p>
+      <w:pPr>
+        <w:spacing w:after="40" w:line="360" w:lineRule="auto"/>
+        <w:rPr>
+          <w:rFonts w:hint="default" w:ascii="Times New Roman" w:hAnsi="Times New Roman" w:cs="Times New Roman"/>
+          <w:sz w:val="24"/>
+          <w:szCs w:val="24"/>
+          <w:shd w:val="clear" w:color="FFFFFF" w:fill="D9D9D9"/>
+        </w:rPr>
+      </w:pPr>
+      <w:r>
+        <w:rPr>
+          <w:rFonts w:hint="default" w:ascii="Times New Roman" w:hAnsi="Times New Roman" w:eastAsia="Consolas" w:cs="Times New Roman"/>
+          <w:color w:val="7030A0"/>
+          <w:sz w:val="24"/>
+          <w:szCs w:val="24"/>
+          <w:shd w:val="clear" w:color="FFFFFF" w:fill="D9D9D9"/>
+        </w:rPr>
+        <w:t xml:space="preserve">Document </w:t>
+      </w:r>
+      <w:r>
+        <w:rPr>
+          <w:rFonts w:hint="default" w:ascii="Times New Roman" w:hAnsi="Times New Roman" w:eastAsia="Consolas" w:cs="Times New Roman"/>
+          <w:sz w:val="24"/>
+          <w:szCs w:val="24"/>
+          <w:shd w:val="clear" w:color="FFFFFF" w:fill="D9D9D9"/>
+        </w:rPr>
+        <w:t>:</w:t>
+      </w:r>
+    </w:p>
+    <w:p>
+      <w:pPr>
+        <w:spacing w:after="40" w:line="360" w:lineRule="auto"/>
+        <w:rPr>
+          <w:rFonts w:hint="default" w:ascii="Times New Roman" w:hAnsi="Times New Roman" w:eastAsia="Consolas" w:cs="Times New Roman"/>
+          <w:sz w:val="24"/>
+          <w:szCs w:val="24"/>
+          <w:shd w:val="clear" w:color="FFFFFF" w:fill="D9D9D9"/>
+        </w:rPr>
+      </w:pPr>
+      <w:r>
+        <w:rPr>
+          <w:rFonts w:hint="default" w:ascii="Times New Roman" w:hAnsi="Times New Roman" w:eastAsia="Consolas" w:cs="Times New Roman"/>
+          <w:sz w:val="24"/>
+          <w:szCs w:val="24"/>
+          <w:shd w:val="clear" w:color="FFFFFF" w:fill="D9D9D9"/>
+        </w:rPr>
+        <w:t>{{DOCUMENT_FR}}</w:t>
+      </w:r>
+    </w:p>
+    <w:p>
+      <w:pPr>
+        <w:spacing w:after="40" w:line="360" w:lineRule="auto"/>
+        <w:rPr>
+          <w:rFonts w:hint="default" w:ascii="Times New Roman" w:hAnsi="Times New Roman" w:eastAsia="Consolas" w:cs="Times New Roman"/>
+          <w:sz w:val="24"/>
+          <w:szCs w:val="24"/>
+          <w:shd w:val="clear" w:color="FFFFFF" w:fill="D9D9D9"/>
+          <w:lang w:val="en-US"/>
+        </w:rPr>
+      </w:pPr>
+    </w:p>
+    <w:p>
+      <w:pPr>
+        <w:numPr>
+          <w:ilvl w:val="0"/>
+          <w:numId w:val="2"/>
+        </w:numPr>
+        <w:spacing w:line="360" w:lineRule="auto"/>
+        <w:ind w:left="0" w:leftChars="0" w:firstLine="0" w:firstLineChars="0"/>
+        <w:rPr>
+          <w:rFonts w:hint="default" w:ascii="Times New Roman" w:hAnsi="Times New Roman" w:cs="Times New Roman"/>
+          <w:color w:val="auto"/>
+          <w:sz w:val="24"/>
+          <w:szCs w:val="24"/>
+          <w:lang w:val="en-US"/>
+        </w:rPr>
+      </w:pPr>
+      <w:r>
+        <w:rPr>
+          <w:rFonts w:hint="default" w:ascii="Times New Roman" w:hAnsi="Times New Roman" w:cs="Times New Roman"/>
+          <w:color w:val="auto"/>
+          <w:sz w:val="24"/>
+          <w:szCs w:val="24"/>
+          <w:lang w:val="en-US"/>
+        </w:rPr>
+        <w:t>Créer un prompt permettant de classer un ticket informatique dans une catégorie (réseau, logiciel, matériel, sécurité, accès, autre). La réponse est au format JSON avec les champs categorie et justification</w:t>
+      </w:r>
+    </w:p>
+    <w:p>
+      <w:pPr>
+        <w:numPr>
+          <w:numId w:val="0"/>
+        </w:numPr>
+        <w:spacing w:line="360" w:lineRule="auto"/>
+        <w:ind w:leftChars="0"/>
+        <w:rPr>
+          <w:rFonts w:hint="default" w:ascii="Times New Roman" w:hAnsi="Times New Roman" w:cs="Times New Roman"/>
+          <w:color w:val="auto"/>
+          <w:sz w:val="24"/>
+          <w:szCs w:val="24"/>
+          <w:lang w:val="en-US"/>
+        </w:rPr>
+      </w:pPr>
+    </w:p>
+    <w:p>
+      <w:pPr>
+        <w:spacing w:before="40" w:after="60" w:line="360" w:lineRule="auto"/>
+        <w:rPr>
+          <w:rFonts w:hint="default" w:ascii="Times New Roman" w:hAnsi="Times New Roman" w:cs="Times New Roman"/>
+          <w:sz w:val="24"/>
+          <w:szCs w:val="24"/>
+        </w:rPr>
+      </w:pPr>
+      <w:r>
+        <w:rPr>
+          <w:rFonts w:hint="default" w:ascii="Times New Roman" w:hAnsi="Times New Roman" w:cs="Times New Roman"/>
+          <w:b/>
+          <w:bCs/>
+          <w:color w:val="555555"/>
+          <w:sz w:val="24"/>
+          <w:szCs w:val="24"/>
+        </w:rPr>
+        <w:t>PROMPT</w:t>
+      </w:r>
+    </w:p>
+    <w:p>
+      <w:pPr>
+        <w:spacing w:after="40" w:line="360" w:lineRule="auto"/>
+        <w:rPr>
+          <w:rFonts w:hint="default" w:ascii="Times New Roman" w:hAnsi="Times New Roman" w:cs="Times New Roman"/>
+          <w:sz w:val="24"/>
+          <w:szCs w:val="24"/>
+        </w:rPr>
+      </w:pPr>
+      <w:r>
+        <w:rPr>
+          <w:rFonts w:hint="default" w:ascii="Times New Roman" w:hAnsi="Times New Roman" w:eastAsia="Consolas" w:cs="Times New Roman"/>
+          <w:sz w:val="24"/>
+          <w:szCs w:val="24"/>
+        </w:rPr>
+        <w:t>Tu es un système de triage de tickets informatiques.</w:t>
+      </w:r>
+    </w:p>
+    <w:p>
+      <w:pPr>
+        <w:spacing w:after="40" w:line="360" w:lineRule="auto"/>
+        <w:rPr>
+          <w:rFonts w:hint="default" w:ascii="Times New Roman" w:hAnsi="Times New Roman" w:cs="Times New Roman"/>
+          <w:sz w:val="24"/>
+          <w:szCs w:val="24"/>
+        </w:rPr>
+      </w:pPr>
+      <w:r>
+        <w:rPr>
+          <w:rFonts w:hint="default" w:ascii="Times New Roman" w:hAnsi="Times New Roman" w:eastAsia="Consolas" w:cs="Times New Roman"/>
+          <w:sz w:val="24"/>
+          <w:szCs w:val="24"/>
+        </w:rPr>
+        <w:t>Classe le ticket ci-dessous dans une seule catégorie parmi : réseau,</w:t>
+      </w:r>
+    </w:p>
+    <w:p>
+      <w:pPr>
+        <w:spacing w:after="40" w:line="360" w:lineRule="auto"/>
+        <w:rPr>
+          <w:rFonts w:hint="default" w:ascii="Times New Roman" w:hAnsi="Times New Roman" w:cs="Times New Roman"/>
+          <w:sz w:val="24"/>
+          <w:szCs w:val="24"/>
+        </w:rPr>
+      </w:pPr>
+      <w:r>
+        <w:rPr>
+          <w:rFonts w:hint="default" w:ascii="Times New Roman" w:hAnsi="Times New Roman" w:eastAsia="Consolas" w:cs="Times New Roman"/>
+          <w:sz w:val="24"/>
+          <w:szCs w:val="24"/>
+        </w:rPr>
+        <w:t>logiciel, matériel, sécurité, accès, autre.</w:t>
+      </w:r>
+    </w:p>
+    <w:p>
+      <w:pPr>
+        <w:spacing w:after="40" w:line="360" w:lineRule="auto"/>
+        <w:rPr>
+          <w:rFonts w:hint="default" w:ascii="Times New Roman" w:hAnsi="Times New Roman" w:cs="Times New Roman"/>
+          <w:sz w:val="24"/>
+          <w:szCs w:val="24"/>
+        </w:rPr>
+      </w:pPr>
+      <w:r>
+        <w:rPr>
+          <w:rFonts w:hint="default" w:ascii="Times New Roman" w:hAnsi="Times New Roman" w:eastAsia="Consolas" w:cs="Times New Roman"/>
+          <w:sz w:val="24"/>
+          <w:szCs w:val="24"/>
+        </w:rPr>
+        <w:t>Réponds UNIQUEMENT au format JSON suivant, sans texte additionnel :</w:t>
+      </w:r>
+    </w:p>
+    <w:p>
+      <w:pPr>
+        <w:spacing w:after="40" w:line="360" w:lineRule="auto"/>
+        <w:rPr>
+          <w:rFonts w:hint="default" w:ascii="Times New Roman" w:hAnsi="Times New Roman" w:cs="Times New Roman"/>
+          <w:sz w:val="24"/>
+          <w:szCs w:val="24"/>
+        </w:rPr>
+      </w:pPr>
+      <w:r>
+        <w:rPr>
+          <w:rFonts w:hint="default" w:ascii="Times New Roman" w:hAnsi="Times New Roman" w:eastAsia="Consolas" w:cs="Times New Roman"/>
+          <w:sz w:val="24"/>
+          <w:szCs w:val="24"/>
+        </w:rPr>
+        <w:t>{ "categorie": "...", "justification": "..." }</w:t>
+      </w:r>
+    </w:p>
+    <w:p>
+      <w:pPr>
+        <w:spacing w:after="40" w:line="360" w:lineRule="auto"/>
+        <w:rPr>
+          <w:rFonts w:hint="default" w:ascii="Times New Roman" w:hAnsi="Times New Roman" w:cs="Times New Roman"/>
+          <w:sz w:val="24"/>
+          <w:szCs w:val="24"/>
+        </w:rPr>
+      </w:pPr>
+    </w:p>
+    <w:p>
+      <w:pPr>
+        <w:spacing w:after="40" w:line="360" w:lineRule="auto"/>
+        <w:rPr>
+          <w:rFonts w:hint="default" w:ascii="Times New Roman" w:hAnsi="Times New Roman" w:cs="Times New Roman"/>
+          <w:sz w:val="24"/>
+          <w:szCs w:val="24"/>
+        </w:rPr>
+      </w:pPr>
+      <w:r>
+        <w:rPr>
+          <w:rFonts w:hint="default" w:ascii="Times New Roman" w:hAnsi="Times New Roman" w:eastAsia="Consolas" w:cs="Times New Roman"/>
+          <w:sz w:val="24"/>
+          <w:szCs w:val="24"/>
+        </w:rPr>
+        <w:t>Ticket : "Impossible de me connecter au VPN de l'entreprise depuis ce</w:t>
+      </w:r>
+    </w:p>
+    <w:p>
+      <w:pPr>
+        <w:numPr>
+          <w:numId w:val="0"/>
+        </w:numPr>
+        <w:spacing w:line="360" w:lineRule="auto"/>
+        <w:ind w:leftChars="0"/>
+        <w:rPr>
+          <w:rFonts w:hint="default" w:ascii="Times New Roman" w:hAnsi="Times New Roman" w:eastAsia="Consolas" w:cs="Times New Roman"/>
+          <w:sz w:val="24"/>
+          <w:szCs w:val="24"/>
+        </w:rPr>
+      </w:pPr>
+      <w:r>
+        <w:rPr>
+          <w:rFonts w:hint="default" w:ascii="Times New Roman" w:hAnsi="Times New Roman" w:eastAsia="Consolas" w:cs="Times New Roman"/>
+          <w:sz w:val="24"/>
+          <w:szCs w:val="24"/>
+        </w:rPr>
+        <w:t>matin, message d'erreur 'connexion refusée'."</w:t>
+      </w:r>
+    </w:p>
+    <w:p>
+      <w:pPr>
+        <w:numPr>
+          <w:numId w:val="0"/>
+        </w:numPr>
+        <w:spacing w:line="360" w:lineRule="auto"/>
+        <w:ind w:leftChars="0"/>
+        <w:rPr>
+          <w:rFonts w:hint="default" w:ascii="Times New Roman" w:hAnsi="Times New Roman" w:eastAsia="Consolas" w:cs="Times New Roman"/>
+          <w:sz w:val="24"/>
+          <w:szCs w:val="24"/>
+        </w:rPr>
+      </w:pPr>
+    </w:p>
+    <w:p>
+      <w:pPr>
+        <w:numPr>
+          <w:numId w:val="0"/>
+        </w:numPr>
+        <w:spacing w:line="360" w:lineRule="auto"/>
+        <w:ind w:leftChars="0"/>
+        <w:rPr>
+          <w:rFonts w:hint="default" w:ascii="Times New Roman" w:hAnsi="Times New Roman" w:eastAsia="Consolas" w:cs="Times New Roman"/>
+          <w:sz w:val="24"/>
+          <w:szCs w:val="24"/>
+          <w:lang w:val="en-US"/>
+        </w:rPr>
+      </w:pPr>
+      <w:r>
+        <w:drawing>
+          <wp:inline distT="0" distB="0" distL="114300" distR="114300">
+            <wp:extent cx="5272405" cy="2499360"/>
+            <wp:effectExtent l="0" t="0" r="10795" b="2540"/>
+            <wp:docPr id="9" name="Picture 9"/>
+            <wp:cNvGraphicFramePr>
+              <a:graphicFrameLocks xmlns:a="http://schemas.openxmlformats.org/drawingml/2006/main" noChangeAspect="1"/>
+            </wp:cNvGraphicFramePr>
+            <a:graphic xmlns:a="http://schemas.openxmlformats.org/drawingml/2006/main">
+              <a:graphicData uri="http://schemas.openxmlformats.org/drawingml/2006/picture">
+                <pic:pic xmlns:pic="http://schemas.openxmlformats.org/drawingml/2006/picture">
+                  <pic:nvPicPr>
+                    <pic:cNvPr id="9" name="Picture 9"/>
+                    <pic:cNvPicPr>
+                      <a:picLocks noChangeAspect="1"/>
+                    </pic:cNvPicPr>
+                  </pic:nvPicPr>
+                  <pic:blipFill>
+                    <a:blip r:embed="rId12"/>
+                    <a:stretch>
+                      <a:fillRect/>
+                    </a:stretch>
+                  </pic:blipFill>
+                  <pic:spPr>
+                    <a:xfrm>
+                      <a:off x="0" y="0"/>
+                      <a:ext cx="5272405" cy="2499360"/>
+                    </a:xfrm>
+                    <a:prstGeom prst="rect">
+                      <a:avLst/>
+                    </a:prstGeom>
+                    <a:noFill/>
+                    <a:ln>
+                      <a:noFill/>
+                    </a:ln>
+                  </pic:spPr>
+                </pic:pic>
+              </a:graphicData>
+            </a:graphic>
+          </wp:inline>
+        </w:drawing>
+      </w:r>
+    </w:p>
+    <w:p>
+      <w:pPr>
+        <w:numPr>
+          <w:numId w:val="0"/>
+        </w:numPr>
+        <w:spacing w:line="360" w:lineRule="auto"/>
+        <w:ind w:leftChars="0"/>
+        <w:rPr>
+          <w:rFonts w:hint="default" w:ascii="Times New Roman" w:hAnsi="Times New Roman" w:cs="Times New Roman"/>
+          <w:color w:val="auto"/>
+          <w:sz w:val="24"/>
+          <w:szCs w:val="24"/>
+          <w:lang w:val="en-US"/>
+        </w:rPr>
+      </w:pPr>
+      <w:r>
+        <w:rPr>
+          <w:rFonts w:hint="default" w:ascii="Times New Roman" w:hAnsi="Times New Roman" w:cs="Times New Roman"/>
+          <w:color w:val="auto"/>
+          <w:sz w:val="24"/>
+          <w:szCs w:val="24"/>
+          <w:lang w:val="en-US"/>
+        </w:rPr>
+        <w:t>4) Créer un prompt permettant d’extraire, à partir d’une facture, les infos (numéro_facture, date, client, montant_ht, tva, montant_ttc). Retourner uniquement un JSON valide avec null si une info est absente</w:t>
+      </w:r>
+    </w:p>
+    <w:p>
+      <w:pPr>
+        <w:numPr>
+          <w:numId w:val="0"/>
+        </w:numPr>
+        <w:spacing w:line="360" w:lineRule="auto"/>
+        <w:ind w:leftChars="0"/>
+        <w:rPr>
+          <w:rFonts w:hint="default" w:ascii="Times New Roman" w:hAnsi="Times New Roman" w:cs="Times New Roman"/>
+          <w:color w:val="auto"/>
+          <w:sz w:val="24"/>
+          <w:szCs w:val="24"/>
+          <w:lang w:val="en-US"/>
+        </w:rPr>
+      </w:pPr>
+    </w:p>
+    <w:p>
+      <w:pPr>
+        <w:spacing w:before="40" w:after="60" w:line="360" w:lineRule="auto"/>
+        <w:rPr>
+          <w:rFonts w:hint="default" w:ascii="Times New Roman" w:hAnsi="Times New Roman" w:cs="Times New Roman"/>
+          <w:sz w:val="24"/>
+          <w:szCs w:val="24"/>
+        </w:rPr>
+      </w:pPr>
+      <w:r>
+        <w:rPr>
+          <w:rFonts w:hint="default" w:ascii="Times New Roman" w:hAnsi="Times New Roman" w:cs="Times New Roman"/>
+          <w:b/>
+          <w:bCs/>
+          <w:color w:val="555555"/>
+          <w:sz w:val="24"/>
+          <w:szCs w:val="24"/>
+        </w:rPr>
+        <w:t>PROMPT</w:t>
+      </w:r>
+    </w:p>
+    <w:p>
+      <w:pPr>
+        <w:spacing w:after="40" w:line="360" w:lineRule="auto"/>
+        <w:rPr>
+          <w:rFonts w:hint="default" w:ascii="Times New Roman" w:hAnsi="Times New Roman" w:cs="Times New Roman"/>
+          <w:sz w:val="24"/>
+          <w:szCs w:val="24"/>
+        </w:rPr>
+      </w:pPr>
+      <w:r>
+        <w:rPr>
+          <w:rFonts w:hint="default" w:ascii="Times New Roman" w:hAnsi="Times New Roman" w:eastAsia="Consolas" w:cs="Times New Roman"/>
+          <w:sz w:val="24"/>
+          <w:szCs w:val="24"/>
+        </w:rPr>
+        <w:t>Extrais les informations suivantes de la facture ci-dessous :</w:t>
+      </w:r>
+    </w:p>
+    <w:p>
+      <w:pPr>
+        <w:spacing w:after="40" w:line="360" w:lineRule="auto"/>
+        <w:rPr>
+          <w:rFonts w:hint="default" w:ascii="Times New Roman" w:hAnsi="Times New Roman" w:cs="Times New Roman"/>
+          <w:sz w:val="24"/>
+          <w:szCs w:val="24"/>
+        </w:rPr>
+      </w:pPr>
+      <w:r>
+        <w:rPr>
+          <w:rFonts w:hint="default" w:ascii="Times New Roman" w:hAnsi="Times New Roman" w:eastAsia="Consolas" w:cs="Times New Roman"/>
+          <w:sz w:val="24"/>
+          <w:szCs w:val="24"/>
+        </w:rPr>
+        <w:t>numéro_facture, date, client, montant_ht, tva, montant_ttc.</w:t>
+      </w:r>
+    </w:p>
+    <w:p>
+      <w:pPr>
+        <w:spacing w:after="40" w:line="360" w:lineRule="auto"/>
+        <w:rPr>
+          <w:rFonts w:hint="default" w:ascii="Times New Roman" w:hAnsi="Times New Roman" w:cs="Times New Roman"/>
+          <w:sz w:val="24"/>
+          <w:szCs w:val="24"/>
+        </w:rPr>
+      </w:pPr>
+      <w:r>
+        <w:rPr>
+          <w:rFonts w:hint="default" w:ascii="Times New Roman" w:hAnsi="Times New Roman" w:eastAsia="Consolas" w:cs="Times New Roman"/>
+          <w:sz w:val="24"/>
+          <w:szCs w:val="24"/>
+        </w:rPr>
+        <w:t>Retourne UNIQUEMENT un JSON valide avec exactement ces 6 champs.</w:t>
+      </w:r>
+    </w:p>
+    <w:p>
+      <w:pPr>
+        <w:spacing w:after="40" w:line="360" w:lineRule="auto"/>
+        <w:rPr>
+          <w:rFonts w:hint="default" w:ascii="Times New Roman" w:hAnsi="Times New Roman" w:cs="Times New Roman"/>
+          <w:sz w:val="24"/>
+          <w:szCs w:val="24"/>
+        </w:rPr>
+      </w:pPr>
+      <w:r>
+        <w:rPr>
+          <w:rFonts w:hint="default" w:ascii="Times New Roman" w:hAnsi="Times New Roman" w:eastAsia="Consolas" w:cs="Times New Roman"/>
+          <w:sz w:val="24"/>
+          <w:szCs w:val="24"/>
+        </w:rPr>
+        <w:t>Utilise la valeur null pour toute information absente du document</w:t>
+      </w:r>
+    </w:p>
+    <w:p>
+      <w:pPr>
+        <w:spacing w:after="40" w:line="360" w:lineRule="auto"/>
+        <w:rPr>
+          <w:rFonts w:hint="default" w:ascii="Times New Roman" w:hAnsi="Times New Roman" w:cs="Times New Roman"/>
+          <w:sz w:val="24"/>
+          <w:szCs w:val="24"/>
+        </w:rPr>
+      </w:pPr>
+      <w:r>
+        <w:rPr>
+          <w:rFonts w:hint="default" w:ascii="Times New Roman" w:hAnsi="Times New Roman" w:eastAsia="Consolas" w:cs="Times New Roman"/>
+          <w:sz w:val="24"/>
+          <w:szCs w:val="24"/>
+        </w:rPr>
+        <w:t>(n'invente jamais une valeur manquante).</w:t>
+      </w:r>
+    </w:p>
+    <w:p>
+      <w:pPr>
+        <w:spacing w:after="40" w:line="360" w:lineRule="auto"/>
+        <w:rPr>
+          <w:rFonts w:hint="default" w:ascii="Times New Roman" w:hAnsi="Times New Roman" w:cs="Times New Roman"/>
+          <w:sz w:val="24"/>
+          <w:szCs w:val="24"/>
+        </w:rPr>
+      </w:pPr>
+    </w:p>
+    <w:p>
+      <w:pPr>
+        <w:spacing w:after="40" w:line="360" w:lineRule="auto"/>
+        <w:rPr>
+          <w:rFonts w:hint="default" w:ascii="Times New Roman" w:hAnsi="Times New Roman" w:cs="Times New Roman"/>
+          <w:sz w:val="24"/>
+          <w:szCs w:val="24"/>
+        </w:rPr>
+      </w:pPr>
+      <w:r>
+        <w:rPr>
+          <w:rFonts w:hint="default" w:ascii="Times New Roman" w:hAnsi="Times New Roman" w:eastAsia="Consolas" w:cs="Times New Roman"/>
+          <w:color w:val="7030A0"/>
+          <w:sz w:val="24"/>
+          <w:szCs w:val="24"/>
+        </w:rPr>
+        <w:t>Facture :</w:t>
+      </w:r>
+    </w:p>
+    <w:p>
+      <w:pPr>
+        <w:spacing w:after="40" w:line="360" w:lineRule="auto"/>
+        <w:rPr>
+          <w:rFonts w:hint="default" w:ascii="Times New Roman" w:hAnsi="Times New Roman" w:cs="Times New Roman"/>
+          <w:sz w:val="24"/>
+          <w:szCs w:val="24"/>
+        </w:rPr>
+      </w:pPr>
+      <w:r>
+        <w:rPr>
+          <w:rFonts w:hint="default" w:ascii="Times New Roman" w:hAnsi="Times New Roman" w:eastAsia="Consolas" w:cs="Times New Roman"/>
+          <w:sz w:val="24"/>
+          <w:szCs w:val="24"/>
+        </w:rPr>
+        <w:t>{{TEXTE_FACTURE}}</w:t>
+      </w:r>
+    </w:p>
+    <w:p>
+      <w:pPr>
+        <w:numPr>
+          <w:numId w:val="0"/>
+        </w:numPr>
+        <w:spacing w:line="360" w:lineRule="auto"/>
+        <w:ind w:leftChars="0"/>
+        <w:rPr>
+          <w:rFonts w:hint="default" w:ascii="Times New Roman" w:hAnsi="Times New Roman" w:cs="Times New Roman"/>
+          <w:color w:val="auto"/>
+          <w:sz w:val="24"/>
+          <w:szCs w:val="24"/>
+          <w:lang w:val="en-US"/>
+        </w:rPr>
+      </w:pPr>
+      <w:r>
+        <w:drawing>
+          <wp:inline distT="0" distB="0" distL="114300" distR="114300">
+            <wp:extent cx="5271770" cy="3523615"/>
+            <wp:effectExtent l="0" t="0" r="11430" b="6985"/>
+            <wp:docPr id="10" name="Picture 10"/>
+            <wp:cNvGraphicFramePr>
+              <a:graphicFrameLocks xmlns:a="http://schemas.openxmlformats.org/drawingml/2006/main" noChangeAspect="1"/>
+            </wp:cNvGraphicFramePr>
+            <a:graphic xmlns:a="http://schemas.openxmlformats.org/drawingml/2006/main">
+              <a:graphicData uri="http://schemas.openxmlformats.org/drawingml/2006/picture">
+                <pic:pic xmlns:pic="http://schemas.openxmlformats.org/drawingml/2006/picture">
+                  <pic:nvPicPr>
+                    <pic:cNvPr id="10" name="Picture 10"/>
+                    <pic:cNvPicPr>
+                      <a:picLocks noChangeAspect="1"/>
+                    </pic:cNvPicPr>
+                  </pic:nvPicPr>
+                  <pic:blipFill>
+                    <a:blip r:embed="rId13"/>
+                    <a:stretch>
+                      <a:fillRect/>
+                    </a:stretch>
+                  </pic:blipFill>
+                  <pic:spPr>
+                    <a:xfrm>
+                      <a:off x="0" y="0"/>
+                      <a:ext cx="5271770" cy="3523615"/>
+                    </a:xfrm>
+                    <a:prstGeom prst="rect">
+                      <a:avLst/>
+                    </a:prstGeom>
+                    <a:noFill/>
+                    <a:ln>
+                      <a:noFill/>
+                    </a:ln>
+                  </pic:spPr>
+                </pic:pic>
+              </a:graphicData>
+            </a:graphic>
+          </wp:inline>
+        </w:drawing>
+      </w:r>
+    </w:p>
+    <w:p>
+      <w:pPr>
+        <w:numPr>
+          <w:ilvl w:val="0"/>
+          <w:numId w:val="2"/>
+        </w:numPr>
+        <w:spacing w:line="360" w:lineRule="auto"/>
+        <w:ind w:left="0" w:leftChars="0" w:firstLine="0" w:firstLineChars="0"/>
+        <w:rPr>
+          <w:rFonts w:hint="default" w:ascii="Times New Roman" w:hAnsi="Times New Roman" w:cs="Times New Roman"/>
+          <w:color w:val="7030A0"/>
+          <w:sz w:val="24"/>
+          <w:szCs w:val="24"/>
+          <w:lang w:val="en-US"/>
+        </w:rPr>
+      </w:pPr>
+      <w:r>
+        <w:rPr>
+          <w:rFonts w:hint="default" w:ascii="Times New Roman" w:hAnsi="Times New Roman" w:cs="Times New Roman"/>
+          <w:color w:val="auto"/>
+          <w:sz w:val="24"/>
+          <w:szCs w:val="24"/>
+          <w:lang w:val="en-US"/>
+        </w:rPr>
+        <w:t>Créer un prompt permettant de rédiger un email destiné à un client dont la livraison a pris du retard avec les objectifs (reconnaître le retard, présenter des excuses, expliquer la situation sans inventer de cause et proposer une solution), le ton (professionnel, courtois et rassurant) et la longueur maximale (150 mots)</w:t>
+      </w:r>
+      <w:r>
+        <w:rPr>
+          <w:rFonts w:hint="default" w:ascii="Times New Roman" w:hAnsi="Times New Roman" w:cs="Times New Roman"/>
+          <w:color w:val="7030A0"/>
+          <w:sz w:val="24"/>
+          <w:szCs w:val="24"/>
+          <w:lang w:val="en-US"/>
+        </w:rPr>
+        <w:t xml:space="preserve"> </w:t>
+      </w:r>
+    </w:p>
+    <w:p>
+      <w:pPr>
+        <w:numPr>
+          <w:numId w:val="0"/>
+        </w:numPr>
+        <w:spacing w:line="360" w:lineRule="auto"/>
+        <w:ind w:leftChars="0"/>
+        <w:rPr>
+          <w:rFonts w:hint="default" w:ascii="Times New Roman" w:hAnsi="Times New Roman" w:cs="Times New Roman"/>
+          <w:color w:val="7030A0"/>
+          <w:sz w:val="24"/>
+          <w:szCs w:val="24"/>
+          <w:lang w:val="en-US"/>
+        </w:rPr>
+      </w:pPr>
+    </w:p>
+    <w:p>
+      <w:pPr>
+        <w:spacing w:before="40" w:after="60" w:line="360" w:lineRule="auto"/>
+        <w:rPr>
+          <w:rFonts w:hint="default" w:ascii="Times New Roman" w:hAnsi="Times New Roman" w:cs="Times New Roman"/>
+          <w:sz w:val="24"/>
+          <w:szCs w:val="24"/>
+        </w:rPr>
+      </w:pPr>
+      <w:r>
+        <w:rPr>
+          <w:rFonts w:hint="default" w:ascii="Times New Roman" w:hAnsi="Times New Roman" w:cs="Times New Roman"/>
+          <w:b/>
+          <w:bCs/>
+          <w:color w:val="555555"/>
+          <w:sz w:val="24"/>
+          <w:szCs w:val="24"/>
+        </w:rPr>
+        <w:t>PROMPT</w:t>
+      </w:r>
+    </w:p>
+    <w:p>
+      <w:pPr>
+        <w:spacing w:after="40" w:line="360" w:lineRule="auto"/>
+        <w:rPr>
+          <w:rFonts w:hint="default" w:ascii="Times New Roman" w:hAnsi="Times New Roman" w:cs="Times New Roman"/>
+          <w:sz w:val="24"/>
+          <w:szCs w:val="24"/>
+        </w:rPr>
+      </w:pPr>
+      <w:r>
+        <w:rPr>
+          <w:rFonts w:hint="default" w:ascii="Times New Roman" w:hAnsi="Times New Roman" w:eastAsia="Consolas" w:cs="Times New Roman"/>
+          <w:sz w:val="24"/>
+          <w:szCs w:val="24"/>
+        </w:rPr>
+        <w:t>Rédige un email destiné à un client dont la livraison a pris du</w:t>
+      </w:r>
+    </w:p>
+    <w:p>
+      <w:pPr>
+        <w:spacing w:after="40" w:line="360" w:lineRule="auto"/>
+        <w:rPr>
+          <w:rFonts w:hint="default" w:ascii="Times New Roman" w:hAnsi="Times New Roman" w:cs="Times New Roman"/>
+          <w:sz w:val="24"/>
+          <w:szCs w:val="24"/>
+        </w:rPr>
+      </w:pPr>
+      <w:r>
+        <w:rPr>
+          <w:rFonts w:hint="default" w:ascii="Times New Roman" w:hAnsi="Times New Roman" w:eastAsia="Consolas" w:cs="Times New Roman"/>
+          <w:sz w:val="24"/>
+          <w:szCs w:val="24"/>
+        </w:rPr>
+        <w:t>retard, avec les objectifs suivants :</w:t>
+      </w:r>
+    </w:p>
+    <w:p>
+      <w:pPr>
+        <w:spacing w:after="40" w:line="360" w:lineRule="auto"/>
+        <w:rPr>
+          <w:rFonts w:hint="default" w:ascii="Times New Roman" w:hAnsi="Times New Roman" w:cs="Times New Roman"/>
+          <w:sz w:val="24"/>
+          <w:szCs w:val="24"/>
+        </w:rPr>
+      </w:pPr>
+      <w:r>
+        <w:rPr>
+          <w:rFonts w:hint="default" w:ascii="Times New Roman" w:hAnsi="Times New Roman" w:eastAsia="Consolas" w:cs="Times New Roman"/>
+          <w:sz w:val="24"/>
+          <w:szCs w:val="24"/>
+        </w:rPr>
+        <w:t>- Reconnaître clairement le retard.</w:t>
+      </w:r>
+    </w:p>
+    <w:p>
+      <w:pPr>
+        <w:spacing w:after="40" w:line="360" w:lineRule="auto"/>
+        <w:rPr>
+          <w:rFonts w:hint="default" w:ascii="Times New Roman" w:hAnsi="Times New Roman" w:cs="Times New Roman"/>
+          <w:sz w:val="24"/>
+          <w:szCs w:val="24"/>
+        </w:rPr>
+      </w:pPr>
+      <w:r>
+        <w:rPr>
+          <w:rFonts w:hint="default" w:ascii="Times New Roman" w:hAnsi="Times New Roman" w:eastAsia="Consolas" w:cs="Times New Roman"/>
+          <w:sz w:val="24"/>
+          <w:szCs w:val="24"/>
+        </w:rPr>
+        <w:t>- Présenter des excuses sincères.</w:t>
+      </w:r>
+    </w:p>
+    <w:p>
+      <w:pPr>
+        <w:spacing w:after="40" w:line="360" w:lineRule="auto"/>
+        <w:rPr>
+          <w:rFonts w:hint="default" w:ascii="Times New Roman" w:hAnsi="Times New Roman" w:cs="Times New Roman"/>
+          <w:sz w:val="24"/>
+          <w:szCs w:val="24"/>
+        </w:rPr>
+      </w:pPr>
+      <w:r>
+        <w:rPr>
+          <w:rFonts w:hint="default" w:ascii="Times New Roman" w:hAnsi="Times New Roman" w:eastAsia="Consolas" w:cs="Times New Roman"/>
+          <w:sz w:val="24"/>
+          <w:szCs w:val="24"/>
+        </w:rPr>
+        <w:t>- Expliquer la situation sans inventer de cause si elle n'est pas</w:t>
+      </w:r>
+    </w:p>
+    <w:p>
+      <w:pPr>
+        <w:spacing w:after="40" w:line="360" w:lineRule="auto"/>
+        <w:rPr>
+          <w:rFonts w:hint="default" w:ascii="Times New Roman" w:hAnsi="Times New Roman" w:cs="Times New Roman"/>
+          <w:sz w:val="24"/>
+          <w:szCs w:val="24"/>
+        </w:rPr>
+      </w:pPr>
+      <w:r>
+        <w:rPr>
+          <w:rFonts w:hint="default" w:ascii="Times New Roman" w:hAnsi="Times New Roman" w:eastAsia="Consolas" w:cs="Times New Roman"/>
+          <w:sz w:val="24"/>
+          <w:szCs w:val="24"/>
+        </w:rPr>
+        <w:t xml:space="preserve">  fournie (rester général si nécessaire, ex. "un contretemps</w:t>
+      </w:r>
+    </w:p>
+    <w:p>
+      <w:pPr>
+        <w:spacing w:after="40" w:line="360" w:lineRule="auto"/>
+        <w:rPr>
+          <w:rFonts w:hint="default" w:ascii="Times New Roman" w:hAnsi="Times New Roman" w:cs="Times New Roman"/>
+          <w:sz w:val="24"/>
+          <w:szCs w:val="24"/>
+        </w:rPr>
+      </w:pPr>
+      <w:r>
+        <w:rPr>
+          <w:rFonts w:hint="default" w:ascii="Times New Roman" w:hAnsi="Times New Roman" w:eastAsia="Consolas" w:cs="Times New Roman"/>
+          <w:sz w:val="24"/>
+          <w:szCs w:val="24"/>
+        </w:rPr>
+        <w:t xml:space="preserve">  logistique").</w:t>
+      </w:r>
+    </w:p>
+    <w:p>
+      <w:pPr>
+        <w:spacing w:after="40" w:line="360" w:lineRule="auto"/>
+        <w:rPr>
+          <w:rFonts w:hint="default" w:ascii="Times New Roman" w:hAnsi="Times New Roman" w:cs="Times New Roman"/>
+          <w:sz w:val="24"/>
+          <w:szCs w:val="24"/>
+        </w:rPr>
+      </w:pPr>
+      <w:r>
+        <w:rPr>
+          <w:rFonts w:hint="default" w:ascii="Times New Roman" w:hAnsi="Times New Roman" w:eastAsia="Consolas" w:cs="Times New Roman"/>
+          <w:sz w:val="24"/>
+          <w:szCs w:val="24"/>
+        </w:rPr>
+        <w:t>- Proposer une solution concrète (geste commercial, nouveau délai,</w:t>
+      </w:r>
+    </w:p>
+    <w:p>
+      <w:pPr>
+        <w:spacing w:after="40" w:line="360" w:lineRule="auto"/>
+        <w:rPr>
+          <w:rFonts w:hint="default" w:ascii="Times New Roman" w:hAnsi="Times New Roman" w:cs="Times New Roman"/>
+          <w:sz w:val="24"/>
+          <w:szCs w:val="24"/>
+        </w:rPr>
+      </w:pPr>
+      <w:r>
+        <w:rPr>
+          <w:rFonts w:hint="default" w:ascii="Times New Roman" w:hAnsi="Times New Roman" w:eastAsia="Consolas" w:cs="Times New Roman"/>
+          <w:sz w:val="24"/>
+          <w:szCs w:val="24"/>
+        </w:rPr>
+        <w:t xml:space="preserve">  suivi personnalisé).</w:t>
+      </w:r>
+    </w:p>
+    <w:p>
+      <w:pPr>
+        <w:spacing w:after="40" w:line="360" w:lineRule="auto"/>
+        <w:rPr>
+          <w:rFonts w:hint="default" w:ascii="Times New Roman" w:hAnsi="Times New Roman" w:cs="Times New Roman"/>
+          <w:sz w:val="24"/>
+          <w:szCs w:val="24"/>
+        </w:rPr>
+      </w:pPr>
+      <w:r>
+        <w:rPr>
+          <w:rFonts w:hint="default" w:ascii="Times New Roman" w:hAnsi="Times New Roman" w:eastAsia="Consolas" w:cs="Times New Roman"/>
+          <w:sz w:val="24"/>
+          <w:szCs w:val="24"/>
+        </w:rPr>
+        <w:t>Ton : professionnel, courtois et rassurant.</w:t>
+      </w:r>
+    </w:p>
+    <w:p>
+      <w:pPr>
+        <w:numPr>
+          <w:numId w:val="0"/>
+        </w:numPr>
+        <w:spacing w:line="360" w:lineRule="auto"/>
+        <w:ind w:leftChars="0"/>
+        <w:rPr>
+          <w:rFonts w:hint="default" w:ascii="Times New Roman" w:hAnsi="Times New Roman" w:eastAsia="Consolas" w:cs="Times New Roman"/>
+          <w:sz w:val="24"/>
+          <w:szCs w:val="24"/>
+        </w:rPr>
+      </w:pPr>
+      <w:r>
+        <w:rPr>
+          <w:rFonts w:hint="default" w:ascii="Times New Roman" w:hAnsi="Times New Roman" w:eastAsia="Consolas" w:cs="Times New Roman"/>
+          <w:sz w:val="24"/>
+          <w:szCs w:val="24"/>
+        </w:rPr>
+        <w:t>Longueur maximale : 150 mots.</w:t>
+      </w:r>
+    </w:p>
+    <w:p>
+      <w:pPr>
+        <w:numPr>
+          <w:numId w:val="0"/>
+        </w:numPr>
+        <w:spacing w:line="360" w:lineRule="auto"/>
+        <w:ind w:leftChars="0"/>
+        <w:rPr>
+          <w:rFonts w:hint="default" w:ascii="Times New Roman" w:hAnsi="Times New Roman" w:eastAsia="Consolas" w:cs="Times New Roman"/>
+          <w:sz w:val="24"/>
+          <w:szCs w:val="24"/>
+          <w:lang w:val="en-US"/>
+        </w:rPr>
+      </w:pPr>
+      <w:r>
+        <w:drawing>
+          <wp:inline distT="0" distB="0" distL="114300" distR="114300">
+            <wp:extent cx="4724400" cy="4533900"/>
+            <wp:effectExtent l="0" t="0" r="0" b="0"/>
+            <wp:docPr id="12" name="Picture 12"/>
+            <wp:cNvGraphicFramePr>
+              <a:graphicFrameLocks xmlns:a="http://schemas.openxmlformats.org/drawingml/2006/main" noChangeAspect="1"/>
+            </wp:cNvGraphicFramePr>
+            <a:graphic xmlns:a="http://schemas.openxmlformats.org/drawingml/2006/main">
+              <a:graphicData uri="http://schemas.openxmlformats.org/drawingml/2006/picture">
+                <pic:pic xmlns:pic="http://schemas.openxmlformats.org/drawingml/2006/picture">
+                  <pic:nvPicPr>
+                    <pic:cNvPr id="12" name="Picture 12"/>
+                    <pic:cNvPicPr>
+                      <a:picLocks noChangeAspect="1"/>
+                    </pic:cNvPicPr>
+                  </pic:nvPicPr>
+                  <pic:blipFill>
+                    <a:blip r:embed="rId14"/>
+                    <a:stretch>
+                      <a:fillRect/>
+                    </a:stretch>
+                  </pic:blipFill>
+                  <pic:spPr>
+                    <a:xfrm>
+                      <a:off x="0" y="0"/>
+                      <a:ext cx="4724400" cy="4533900"/>
+                    </a:xfrm>
+                    <a:prstGeom prst="rect">
+                      <a:avLst/>
+                    </a:prstGeom>
+                    <a:noFill/>
+                    <a:ln>
+                      <a:noFill/>
+                    </a:ln>
+                  </pic:spPr>
+                </pic:pic>
+              </a:graphicData>
+            </a:graphic>
+          </wp:inline>
+        </w:drawing>
+      </w:r>
+      <w:bookmarkStart w:id="0" w:name="_GoBack"/>
+      <w:bookmarkEnd w:id="0"/>
     </w:p>
     <w:sectPr>
       <w:pgSz w:w="11906" w:h="16838"/>

</xml_diff>